<commit_message>
Curriculo Fase 1 (arquitectura academica) y Fase 1B (programas publicos, folleto y WhatsApp); Zoom de pago en plan y kits
- Curriculo/Fase1_Arquitectura_Academica.md: 16 puntos del brief + mapa curricular maestro, revisado por lente de coreano nativo y de coherencia (43 correcciones aplicadas)
- Curriculo/publico: programa publico de los 6 cursos, version web con calendario, comparacion y guia de nivel, folleto docx/pdf y mensaje de WhatsApp
- Zoom de pago de la academia: Jay crea las 6 reuniones y envia link + clave de anfitrion antes del mie 7; kits de Kiran y Abby regenerados (docx/pdf) y mensajes actualizados
- Mensajes_Alumnos: Conversacional 1 y TOPIK II entran a las 21:00 en punto (misma cuenta de Zoom que la clase de las 20:00)
- Plan: nuevas decisiones pendientes (grabaciones, libros, cambio de seccion, logro "decir la hora" de Basico 1)

Co-Authored-By: Claude Opus 5.5 <noreply@anthropic.com>
</commit_message>
<xml_diff>
--- a/Lanzamiento_Octubre_2026/profes/Kit_Abby_Conversacional_Ninos_KO.docx
+++ b/Lanzamiento_Octubre_2026/profes/Kit_Abby_Conversacional_Ninos_KO.docx
@@ -219,7 +219,7 @@
           <w:sz w:val="17"/>
           <w:szCs w:val="17"/>
         </w:rPr>
-        <w:t xml:space="preserve">버전 1.0 · 2026년 9월 25일(금) · 교사용 내부 문서. 수업 정보 출처: academiaseul.com/programa, 전체 프로그램 Part III(교사 가이드).</w:t>
+        <w:t xml:space="preserve">버전 1.1 · 2026년 9월 25일(금) · 교사용 내부 문서. 수업 정보 출처: academiaseul.com/programa, 전체 프로그램 Part III(교사 가이드).</w:t>
       </w:r>
     </w:p>
     <w:p>
@@ -3777,7 +3777,7 @@
                 <w:sz w:val="18"/>
                 <w:szCs w:val="18"/>
               </w:rPr>
-              <w:t xml:space="preserve">10월 7일(수)</w:t>
+              <w:t xml:space="preserve">10월 7일(수)까지</w:t>
             </w:r>
           </w:p>
         </w:tc>
@@ -3804,7 +3804,7 @@
                 <w:sz w:val="18"/>
                 <w:szCs w:val="18"/>
               </w:rPr>
-              <w:t xml:space="preserve">10월 7일(수)</w:t>
+              <w:t xml:space="preserve">10월 7일(수)까지</w:t>
             </w:r>
           </w:p>
         </w:tc>
@@ -3831,7 +3831,7 @@
                 <w:sz w:val="18"/>
                 <w:szCs w:val="18"/>
               </w:rPr>
-              <w:t xml:space="preserve">매주 반복 Zoom 링크 마감 (또는 학원 계정 사용 확인)</w:t>
+              <w:t xml:space="preserve">Jay가 Zoom 링크(학원 유료 계정, 8회 반복 회의)와 호스트 키를 보내 드려요. 선생님이 링크를 만들거나 보내실 필요는 없어요.</w:t>
             </w:r>
           </w:p>
         </w:tc>
@@ -3858,7 +3858,7 @@
                 <w:sz w:val="18"/>
                 <w:szCs w:val="18"/>
               </w:rPr>
-              <w:t xml:space="preserve">선생님</w:t>
+              <w:t xml:space="preserve">Jay → 선생님</w:t>
             </w:r>
           </w:p>
         </w:tc>
@@ -10268,7 +10268,7 @@
           <w:sz w:val="22"/>
           <w:szCs w:val="22"/>
         </w:rPr>
-        <w:t xml:space="preserve">부탁드리는 일 4가지와 마감일입니다 (한국 시간, 괄호 안은 칠레). 일정이 어려우시면 마감 전에 편하게 말씀해 주세요.</w:t>
+        <w:t xml:space="preserve">첫 수업 전에 부탁드리는 일과 받으실 것, 그리고 마감일입니다 (한국 시간, 괄호 안은 칠레). 일정이 어려우시면 마감 전에 편하게 말씀해 주세요.</w:t>
       </w:r>
     </w:p>
     <w:tbl>
@@ -10577,7 +10577,7 @@
                 <w:sz w:val="18"/>
                 <w:szCs w:val="18"/>
               </w:rPr>
-              <w:t xml:space="preserve">매주 반복 Zoom 링크 (회화 1 + 어린이반) 또는 학원 계정 사용 확인</w:t>
+              <w:t xml:space="preserve">Jay에게 Zoom 링크와 호스트 키 받기</w:t>
             </w:r>
           </w:p>
         </w:tc>
@@ -10604,7 +10604,7 @@
                 <w:sz w:val="18"/>
                 <w:szCs w:val="18"/>
               </w:rPr>
-              <w:t xml:space="preserve">10월 7일(수) (칠레 10월 7일(수))</w:t>
+              <w:t xml:space="preserve">10월 7일(수)까지 (칠레 10월 7일(수)까지)</w:t>
             </w:r>
           </w:p>
         </w:tc>
@@ -10631,7 +10631,7 @@
                 <w:sz w:val="18"/>
                 <w:szCs w:val="18"/>
               </w:rPr>
-              <w:t xml:space="preserve">소그룹 방(breakout rooms) 허용, 클라우드 녹화 켜기. 어린이반 호스트는 Jay와 정해요. 링크는 Jay가 첫 수업 전에 학생들에게 전달합니다.</w:t>
+              <w:t xml:space="preserve">Jay가 Zoom 링크(학원 유료 계정, 8회 반복 회의)와 호스트 키를 10월 7일(수)까지 보내 드려요: 회화 1 링크 하나, 어린이반 링크 하나. 선생님은 링크를 만들거나 보내실 필요가 없어요. 호스트가 되려면 링크로 들어가서 참가자 → '호스트 권한 가져오기'를 누르고 키를 입력하세요. 소그룹 방과 클라우드 녹화는 계정에 미리 켜 둡니다. 회화 1 바로 앞(08:00)에 같은 계정으로 다른 수업이 있어서 그 수업이 08:58에 끝나요: 회화 1은 08:58 이후에 들어와 주세요. 링크는 Jay가 첫 수업 전에 학생들에게 전달합니다.</w:t>
             </w:r>
           </w:p>
         </w:tc>
@@ -12675,7 +12675,7 @@
               </w:rPr>
               <w:t xml:space="preserve">Para repasar: Lector de Hangul → [pestaña exacta] · </w:t>
             </w:r>
-            <w:hyperlink w:history="1" r:id="rIdouln0tuibftitgrl2pdeb">
+            <w:hyperlink w:history="1" r:id="rIdmwn_xvhganbctoywb8urp">
               <w:r>
                 <w:rPr>
                   <w:rFonts w:ascii="Arial" w:cs="Arial" w:eastAsia="Malgun Gothic" w:hAnsi="Arial"/>
@@ -15220,7 +15220,7 @@
             <w:pPr>
               <w:spacing w:after="0" w:line="264"/>
             </w:pPr>
-            <w:hyperlink w:history="1" r:id="rIdxug6rbyfrrldorn4p8vrf">
+            <w:hyperlink w:history="1" r:id="rIdfe842o32fvcyzv-1ell3h">
               <w:r>
                 <w:rPr>
                   <w:rFonts w:ascii="Arial" w:cs="Arial" w:eastAsia="Malgun Gothic" w:hAnsi="Arial"/>
@@ -15283,7 +15283,7 @@
             <w:pPr>
               <w:spacing w:after="0" w:line="264"/>
             </w:pPr>
-            <w:hyperlink w:history="1" r:id="rId_zi2oztymvncsceahd9-p">
+            <w:hyperlink w:history="1" r:id="rIds2aif2sclirn-f2nbwlgj">
               <w:r>
                 <w:rPr>
                   <w:rFonts w:ascii="Arial" w:cs="Arial" w:eastAsia="Malgun Gothic" w:hAnsi="Arial"/>
@@ -15346,7 +15346,7 @@
             <w:pPr>
               <w:spacing w:after="50" w:line="264"/>
             </w:pPr>
-            <w:hyperlink w:history="1" r:id="rIdpk_3upzfic2nozmkl1vvh">
+            <w:hyperlink w:history="1" r:id="rIdm3uabtysbpovrrgjpdwag">
               <w:r>
                 <w:rPr>
                   <w:rFonts w:ascii="Arial" w:cs="Arial" w:eastAsia="Malgun Gothic" w:hAnsi="Arial"/>
@@ -15372,7 +15372,7 @@
               </w:rPr>
               <w:t xml:space="preserve">스페인어판: </w:t>
             </w:r>
-            <w:hyperlink w:history="1" r:id="rIdqj0ariuqfdkrs6nq9lxpf">
+            <w:hyperlink w:history="1" r:id="rIdlkvarrqxp2l6jdev9pvur">
               <w:r>
                 <w:rPr>
                   <w:rFonts w:ascii="Arial" w:cs="Arial" w:eastAsia="Malgun Gothic" w:hAnsi="Arial"/>
@@ -15435,7 +15435,7 @@
             <w:pPr>
               <w:spacing w:after="0" w:line="264"/>
             </w:pPr>
-            <w:hyperlink w:history="1" r:id="rIdipqd0tevcrsuszfokuq-s">
+            <w:hyperlink w:history="1" r:id="rId3_oxftef6pdpa0nlotgle">
               <w:r>
                 <w:rPr>
                   <w:rFonts w:ascii="Arial" w:cs="Arial" w:eastAsia="Malgun Gothic" w:hAnsi="Arial"/>
@@ -15507,7 +15507,7 @@
             <w:pPr>
               <w:spacing w:after="0" w:line="264"/>
             </w:pPr>
-            <w:hyperlink w:history="1" r:id="rIdjtyu3wljtfhybac4iljxz">
+            <w:hyperlink w:history="1" r:id="rIdytcwezw9fm9wnd9gy-xpd">
               <w:r>
                 <w:rPr>
                   <w:rFonts w:ascii="Arial" w:cs="Arial" w:eastAsia="Malgun Gothic" w:hAnsi="Arial"/>
@@ -15579,7 +15579,7 @@
             <w:pPr>
               <w:spacing w:after="0" w:line="264"/>
             </w:pPr>
-            <w:hyperlink w:history="1" r:id="rIdkmpukjgl7rvaiccnd5tk6">
+            <w:hyperlink w:history="1" r:id="rIdehbbw0roeaehdruiuhpz8">
               <w:r>
                 <w:rPr>
                   <w:rFonts w:ascii="Arial" w:cs="Arial" w:eastAsia="Malgun Gothic" w:hAnsi="Arial"/>
@@ -15898,7 +15898,7 @@
                 <w:sz w:val="20"/>
                 <w:szCs w:val="20"/>
               </w:rPr>
-              <w:t xml:space="preserve">[PLACEHOLDER: 선생님이 10월 7일(수)까지 보내 주실 링크]</w:t>
+              <w:t xml:space="preserve">[PLACEHOLDER: 회화 1 링크] · [PLACEHOLDER: 어린이반 링크] — Jay가 Zoom 링크(학원 유료 계정, 8회 반복 회의)와 호스트 키를 10월 7일(수)까지 보내 드려요.</w:t>
             </w:r>
           </w:p>
         </w:tc>
@@ -16057,7 +16057,7 @@
               </w:rPr>
               <w:t xml:space="preserve">+56 9 4211 5562 · </w:t>
             </w:r>
-            <w:hyperlink w:history="1" r:id="rIdzo8bmvnbdvbbumtvh9mi4">
+            <w:hyperlink w:history="1" r:id="rId5qtax56pjmvjmirn1ljnf">
               <w:r>
                 <w:rPr>
                   <w:rFonts w:ascii="Arial" w:cs="Arial" w:eastAsia="Malgun Gothic" w:hAnsi="Arial"/>
@@ -16180,7 +16180,7 @@
             <w:pPr>
               <w:spacing w:after="0" w:line="264"/>
             </w:pPr>
-            <w:hyperlink w:history="1" r:id="rIdrskv1yhp8n3dfpvikusn6">
+            <w:hyperlink w:history="1" r:id="rIdoj51db5apijiauuavku2c">
               <w:r>
                 <w:rPr>
                   <w:rFonts w:ascii="Arial" w:cs="Arial" w:eastAsia="Malgun Gothic" w:hAnsi="Arial"/>

</xml_diff>